<commit_message>
fix late fusion results across report, presentation, and README
Reconcile all reported numbers with the final late_fusion.ipynb run:
best alpha_text=0.45 (not 0.60), Macro F1=0.7108, text/audio baseline
scores, per-class breakdowns, consensus tiers, and corrected-GT table.
Also removes the stale data-leakage caveat and fills in previously
unpopulated TODO tables in docs/report.md.

Co-Authored-By: Claude Sonnet 4.6 <noreply@anthropic.com>
</commit_message>
<xml_diff>
--- a/docs/Final_Report.docx
+++ b/docs/Final_Report.docx
@@ -59,7 +59,7 @@
           <w:i w:val="0"/>
           <w:sz w:val="22"/>
         </w:rPr>
-        <w:t>Introduction to Data Science Project — Semester B 2026</w:t>
+        <w:t>Introduction to Data Science Project - Semester B 2026</w:t>
       </w:r>
     </w:p>
     <w:p>
@@ -109,7 +109,7 @@
           <w:i w:val="0"/>
           <w:sz w:val="22"/>
         </w:rPr>
-        <w:t>This project addresses automatic speech emotion recognition (SER) using the IEMOCAP corpus [1]. The original ten emotion labels were grouped into three classes — Negative, Positive, and Neutral — and three approaches were evaluated: text-only classification using RoBERTa [3], audio-only classification using Wav2Vec2 [5], and late fusion via a weighted combination of output logits. All models were evaluated on a speaker-independent held-out test set (Session 5, n=2,170 utterances) using a Leave-One-Session-Out (LOSO) protocol. The text-only model achieved Macro F1 of 0.6519, the audio-only model 0.6403, and late fusion with the optimal weight α=0.60 improved Macro F1 to 0.7104 — a gain of +0.06 over text-only, requiring no additional training. A systematic weight search confirmed that the text modality carries slightly more signal, and a Sum-then-Argmax robustness check showed the headline results are stable with respect to label construction (Δ &lt; 0.005). Stratification by annotator consensus confirmed that model errors concentrate on utterances that were genuinely ambiguous to human raters. The results demonstrate that text and audio encode largely non-overlapping emotional signals — text captures valence distinctions while audio captures arousal — and that their combination is meaningfully more effective than either modality alone.</w:t>
+        <w:t>This project addresses automatic speech emotion recognition (SER) using the IEMOCAP corpus [1]. The original ten emotion labels were grouped into three classes - Negative, Positive, and Neutral - and three approaches were evaluated: text-only classification using RoBERTa [3], audio-only classification using Wav2Vec2 [5], and late fusion via a weighted combination of output logits. All models were evaluated on a speaker-independent held-out test set (Session 5, n=2,170 utterances) using a Leave-One-Session-Out (LOSO) protocol. The text-only model achieved Macro F1 of 0.6475, the audio-only model 0.6398, and late fusion with the optimal weight α=0.45 improved Macro F1 to 0.7108 - a gain of +0.06 over text-only, requiring no additional training. A systematic weight search confirmed that the text modality carries slightly more signal, and a Sum-then-Argmax robustness check showed the headline results are stable with respect to label construction (Δ &lt; 0.005). Stratification by annotator consensus confirmed that model errors concentrate on utterances that were genuinely ambiguous to human raters. The results demonstrate that text and audio encode largely non-overlapping emotional signals - text captures valence distinctions while audio captures arousal - and that their combination is meaningfully more effective than either modality alone.</w:t>
       </w:r>
     </w:p>
     <w:p>
@@ -152,7 +152,7 @@
           <w:i w:val="0"/>
           <w:sz w:val="22"/>
         </w:rPr>
-        <w:t>Automatic emotion recognition from speech (SER) is the task of identifying the emotional state of a speaker from a recorded utterance [2]. Emotion is expressed simultaneously through multiple channels: the words chosen (the linguistic or text modality) and the acoustic properties of the voice — pitch, energy, and speaking rate. A system that relies on only one channel is inherently limited, because emotional information may reside primarily in the other.</w:t>
+        <w:t>Automatic emotion recognition from speech (SER) is the task of identifying the emotional state of a speaker from a recorded utterance [2]. Emotion is expressed simultaneously through multiple channels: the words chosen (the linguistic or text modality) and the acoustic properties of the voice - pitch, energy, and speaking rate. A system that relies on only one channel is inherently limited, because emotional information may reside primarily in the other.</w:t>
       </w:r>
     </w:p>
     <w:p>
@@ -193,7 +193,7 @@
           <w:i/>
           <w:sz w:val="22"/>
         </w:rPr>
-        <w:t>Can combining text and audio modalities improve automatic emotion recognition over either modality alone — and if so, by how much and why?</w:t>
+        <w:t>Can combining text and audio modalities improve automatic emotion recognition over either modality alone - and if so, by how much and why?</w:t>
       </w:r>
       <w:r>
         <w:rPr>
@@ -625,7 +625,7 @@
           <w:i w:val="0"/>
           <w:sz w:val="22"/>
         </w:rPr>
-        <w:t xml:space="preserve"> After grouping into 3 classes, the distribution is approximately 55% Negative, 27% Positive, and 18% Neutral. A model that always predicts 'Negative' achieves 55% accuracy — making accuracy an uninformative metric and requiring class-weighted loss during training.</w:t>
+        <w:t xml:space="preserve"> After grouping into 3 classes, the distribution is approximately 55% Negative, 27% Positive, and 18% Neutral. A model that always predicts 'Negative' achieves 55% accuracy - making accuracy an uninformative metric and requiring class-weighted loss during training.</w:t>
       </w:r>
     </w:p>
     <w:p>
@@ -1451,7 +1451,7 @@
           <w:i w:val="0"/>
           <w:sz w:val="22"/>
         </w:rPr>
-        <w:t xml:space="preserve">The primary label is derived from IEMOCAP's major_emotion field — the argmax over the 10 raw emotion categories, then grouped (hard-label-then-group). This procedure discards annotator mass that falls in a different group from the single majority vote. To verify this does not bias evaluation, we additionally computed a </w:t>
+        <w:t xml:space="preserve">The primary label is derived from IEMOCAP's major_emotion field - the argmax over the 10 raw emotion categories, then grouped (hard-label-then-group). This procedure discards annotator mass that falls in a different group from the single majority vote. To verify this does not bias evaluation, we additionally computed a </w:t>
       </w:r>
       <w:r>
         <w:rPr>
@@ -1593,7 +1593,7 @@
           <w:i/>
           <w:sz w:val="22"/>
         </w:rPr>
-        <w:t>3.1.2  Model 1 — Text Classification with RoBERTa</w:t>
+        <w:t>3.1.2  Model 1 - Text Classification with RoBERTa</w:t>
       </w:r>
     </w:p>
     <w:p>
@@ -2164,7 +2164,7 @@
                 <w:i w:val="0"/>
                 <w:sz w:val="20"/>
               </w:rPr>
-              <w:t>Epoch 4 of 7</w:t>
+              <w:t>Epoch 7 of 10</w:t>
             </w:r>
           </w:p>
         </w:tc>
@@ -2182,7 +2182,7 @@
                 <w:i w:val="0"/>
                 <w:sz w:val="20"/>
               </w:rPr>
-              <w:t>Training stopped early by patience criterion</w:t>
+              <w:t>Training ran full 10-epoch schedule; patience exhausted at epoch 10</w:t>
             </w:r>
           </w:p>
         </w:tc>
@@ -2255,7 +2255,7 @@
           <w:i/>
           <w:sz w:val="22"/>
         </w:rPr>
-        <w:t>3.1.3  Model 2 — Audio Classification with Wav2Vec2</w:t>
+        <w:t>3.1.3  Model 2 - Audio Classification with Wav2Vec2</w:t>
       </w:r>
     </w:p>
     <w:p>
@@ -2270,7 +2270,7 @@
           <w:i w:val="0"/>
           <w:sz w:val="22"/>
         </w:rPr>
-        <w:t>Wav2Vec2 [5] is a pre-trained speech encoder developed by Facebook AI Research that operates directly on raw 16 kHz waveforms — no hand-crafted features (MFCCs, spectrograms) are required. It was pre-trained on 960 hours of unlabeled English speech (LibriSpeech) using contrastive self-supervised learning: portions of audio are masked, and the model learns to identify the correct representation from distractors [4]. Architecture: a 7-layer convolutional feature encoder followed by a 12-layer transformer encoder (768 hidden dimensions).</w:t>
+        <w:t>Wav2Vec2 [5] is a pre-trained speech encoder developed by Facebook AI Research that operates directly on raw 16 kHz waveforms - no hand-crafted features (MFCCs, spectrograms) are required. It was pre-trained on 960 hours of unlabeled English speech (LibriSpeech) using contrastive self-supervised learning: portions of audio are masked, and the model learns to identify the correct representation from distractors [4]. Architecture: a 7-layer convolutional feature encoder followed by a 12-layer transformer encoder (768 hidden dimensions).</w:t>
       </w:r>
     </w:p>
     <w:p>
@@ -2756,7 +2756,7 @@
                 <w:i w:val="0"/>
                 <w:sz w:val="20"/>
               </w:rPr>
-              <w:t>Epoch 3 of 8</w:t>
+              <w:t>Epoch 4 of 8</w:t>
             </w:r>
           </w:p>
         </w:tc>
@@ -2774,7 +2774,7 @@
                 <w:i w:val="0"/>
                 <w:sz w:val="20"/>
               </w:rPr>
-              <w:t>Training stopped at epoch 6 by patience criterion</w:t>
+              <w:t>Training stopped at epoch 7 by patience criterion</w:t>
             </w:r>
           </w:p>
         </w:tc>
@@ -2847,7 +2847,7 @@
           <w:i/>
           <w:sz w:val="22"/>
         </w:rPr>
-        <w:t>3.1.4  Model 3 — Late Fusion</w:t>
+        <w:t>3.1.4  Model 3 - Late Fusion</w:t>
       </w:r>
     </w:p>
     <w:p>
@@ -2910,7 +2910,7 @@
           <w:i w:val="0"/>
           <w:sz w:val="22"/>
         </w:rPr>
-        <w:t xml:space="preserve"> — fusion operates entirely at evaluation time using already-trained checkpoints. Combining raw logits (rather than softmax probabilities) preserves relative confidence differences between classes and prevents a single overconfident model from dominating the sum.</w:t>
+        <w:t xml:space="preserve"> - fusion operates entirely at evaluation time using already-trained checkpoints. Combining raw logits (rather than softmax probabilities) preserves relative confidence differences between classes and prevents a single overconfident model from dominating the sum.</w:t>
       </w:r>
     </w:p>
     <w:p>
@@ -2942,7 +2942,7 @@
           <w:i w:val="0"/>
           <w:sz w:val="22"/>
         </w:rPr>
-        <w:t xml:space="preserve"> Rather than setting α manually, we swept α ∈ {0.00, 0.05, ..., 1.00} (21 values) on the Session 5 test set, recording Macro F1 at each step. The α maximizing Macro F1 is reported as the best weight. As a sanity check, the value at α=0.0 must reproduce the audio-only score and α=1.0 must reproduce the text-only score — both conditions held exactly.</w:t>
+        <w:t xml:space="preserve"> Rather than setting α manually, we swept α ∈ {0.00, 0.05, ..., 1.00} (21 values) on the Session 5 test set, recording Macro F1 at each step. The α maximizing Macro F1 is reported as the best weight. As a sanity check, the value at α=0.0 must reproduce the audio-only score and α=1.0 must reproduce the text-only score - both conditions held exactly.</w:t>
       </w:r>
     </w:p>
     <w:p>
@@ -2992,7 +2992,7 @@
           <w:i w:val="0"/>
           <w:sz w:val="22"/>
         </w:rPr>
-        <w:t xml:space="preserve"> Fixed linear combination — cannot capture non-linear modality interactions; optimal α is identified on the same test set used for final reporting.</w:t>
+        <w:t xml:space="preserve"> Fixed linear combination - cannot capture non-linear modality interactions; optimal α is identified on the same test set used for final reporting.</w:t>
       </w:r>
     </w:p>
     <w:p>
@@ -3185,7 +3185,7 @@
                 <w:i w:val="0"/>
                 <w:sz w:val="20"/>
               </w:rPr>
-              <w:t>0.6793</w:t>
+              <w:t>0.6843</w:t>
             </w:r>
           </w:p>
         </w:tc>
@@ -3204,7 +3204,7 @@
                 <w:i w:val="0"/>
                 <w:sz w:val="20"/>
               </w:rPr>
-              <w:t>0.6519</w:t>
+              <w:t>0.6475</w:t>
             </w:r>
           </w:p>
         </w:tc>
@@ -3223,7 +3223,7 @@
                 <w:i w:val="0"/>
                 <w:sz w:val="20"/>
               </w:rPr>
-              <w:t>0.6948</w:t>
+              <w:t>0.6937</w:t>
             </w:r>
           </w:p>
         </w:tc>
@@ -3263,7 +3263,7 @@
                 <w:i w:val="0"/>
                 <w:sz w:val="20"/>
               </w:rPr>
-              <w:t>0.6880</w:t>
+              <w:t>0.6829</w:t>
             </w:r>
           </w:p>
         </w:tc>
@@ -3282,7 +3282,7 @@
                 <w:i w:val="0"/>
                 <w:sz w:val="20"/>
               </w:rPr>
-              <w:t>0.6403</w:t>
+              <w:t>0.6398</w:t>
             </w:r>
           </w:p>
         </w:tc>
@@ -3301,7 +3301,7 @@
                 <w:i w:val="0"/>
                 <w:sz w:val="20"/>
               </w:rPr>
-              <w:t>0.6874</w:t>
+              <w:t>0.6876</w:t>
             </w:r>
           </w:p>
         </w:tc>
@@ -3341,7 +3341,7 @@
                 <w:i w:val="0"/>
                 <w:sz w:val="20"/>
               </w:rPr>
-              <w:t>0.7378</w:t>
+              <w:t>0.7346</w:t>
             </w:r>
           </w:p>
         </w:tc>
@@ -3360,7 +3360,7 @@
                 <w:i w:val="0"/>
                 <w:sz w:val="20"/>
               </w:rPr>
-              <w:t>0.7041</w:t>
+              <w:t>0.6943</w:t>
             </w:r>
           </w:p>
         </w:tc>
@@ -3379,7 +3379,7 @@
                 <w:i w:val="0"/>
                 <w:sz w:val="20"/>
               </w:rPr>
-              <w:t>0.7458</w:t>
+              <w:t>0.7396</w:t>
             </w:r>
           </w:p>
         </w:tc>
@@ -3400,7 +3400,7 @@
                 <w:i w:val="0"/>
                 <w:sz w:val="20"/>
               </w:rPr>
-              <w:t>Late Fusion (best α=0.60)</w:t>
+              <w:t>Late Fusion (best α=0.45)</w:t>
             </w:r>
           </w:p>
         </w:tc>
@@ -3419,7 +3419,7 @@
                 <w:i w:val="0"/>
                 <w:sz w:val="20"/>
               </w:rPr>
-              <w:t>—</w:t>
+              <w:t>0.7502</w:t>
             </w:r>
           </w:p>
         </w:tc>
@@ -3438,7 +3438,7 @@
                 <w:i w:val="0"/>
                 <w:sz w:val="20"/>
               </w:rPr>
-              <w:t>0.7104</w:t>
+              <w:t>0.7108</w:t>
             </w:r>
           </w:p>
         </w:tc>
@@ -3457,7 +3457,7 @@
                 <w:i w:val="0"/>
                 <w:sz w:val="20"/>
               </w:rPr>
-              <w:t>—</w:t>
+              <w:t>0.7541</w:t>
             </w:r>
           </w:p>
         </w:tc>
@@ -3480,7 +3480,7 @@
           <w:i w:val="0"/>
           <w:sz w:val="22"/>
         </w:rPr>
-        <w:t xml:space="preserve">Both unimodal models achieve similar Macro F1 (0.65 and 0.64). Late fusion at the optimal weight α=0.60 achieves 0.7104 — a gain of </w:t>
+        <w:t xml:space="preserve">Both unimodal models achieve similar Macro F1 (0.65 and 0.64). Late fusion at the optimal weight α=0.45 achieves 0.7108 - a gain of </w:t>
       </w:r>
       <w:r>
         <w:rPr>
@@ -3720,7 +3720,7 @@
                 <w:i w:val="0"/>
                 <w:sz w:val="20"/>
               </w:rPr>
-              <w:t>0.86</w:t>
+              <w:t>0.81</w:t>
             </w:r>
           </w:p>
         </w:tc>
@@ -3738,7 +3738,7 @@
                 <w:i w:val="0"/>
                 <w:sz w:val="20"/>
               </w:rPr>
-              <w:t>0.68</w:t>
+              <w:t>0.72</w:t>
             </w:r>
           </w:p>
         </w:tc>
@@ -3830,7 +3830,7 @@
                 <w:i w:val="0"/>
                 <w:sz w:val="20"/>
               </w:rPr>
-              <w:t>0.72</w:t>
+              <w:t>0.73</w:t>
             </w:r>
           </w:p>
         </w:tc>
@@ -3848,7 +3848,7 @@
                 <w:i w:val="0"/>
                 <w:sz w:val="20"/>
               </w:rPr>
-              <w:t>0.71</w:t>
+              <w:t>0.70</w:t>
             </w:r>
           </w:p>
         </w:tc>
@@ -3866,7 +3866,7 @@
                 <w:i w:val="0"/>
                 <w:sz w:val="20"/>
               </w:rPr>
-              <w:t>0.71</w:t>
+              <w:t>0.72</w:t>
             </w:r>
           </w:p>
         </w:tc>
@@ -3940,7 +3940,7 @@
                 <w:i w:val="0"/>
                 <w:sz w:val="20"/>
               </w:rPr>
-              <w:t>0.39</w:t>
+              <w:t>0.40</w:t>
             </w:r>
           </w:p>
         </w:tc>
@@ -3958,7 +3958,7 @@
                 <w:i w:val="0"/>
                 <w:sz w:val="20"/>
               </w:rPr>
-              <w:t>0.62</w:t>
+              <w:t>0.54</w:t>
             </w:r>
           </w:p>
         </w:tc>
@@ -3976,7 +3976,7 @@
                 <w:i w:val="0"/>
                 <w:sz w:val="20"/>
               </w:rPr>
-              <w:t>0.48</w:t>
+              <w:t>0.46</w:t>
             </w:r>
           </w:p>
         </w:tc>
@@ -4050,7 +4050,7 @@
                 <w:i w:val="0"/>
                 <w:sz w:val="20"/>
               </w:rPr>
-              <w:t>0.76</w:t>
+              <w:t>0.80</w:t>
             </w:r>
           </w:p>
         </w:tc>
@@ -4068,7 +4068,7 @@
                 <w:i w:val="0"/>
                 <w:sz w:val="20"/>
               </w:rPr>
-              <w:t>0.80</w:t>
+              <w:t>0.77</w:t>
             </w:r>
           </w:p>
         </w:tc>
@@ -4160,7 +4160,7 @@
                 <w:i w:val="0"/>
                 <w:sz w:val="20"/>
               </w:rPr>
-              <w:t>0.70</w:t>
+              <w:t>0.68</w:t>
             </w:r>
           </w:p>
         </w:tc>
@@ -4178,7 +4178,7 @@
                 <w:i w:val="0"/>
                 <w:sz w:val="20"/>
               </w:rPr>
-              <w:t>0.58</w:t>
+              <w:t>0.59</w:t>
             </w:r>
           </w:p>
         </w:tc>
@@ -4270,7 +4270,7 @@
                 <w:i w:val="0"/>
                 <w:sz w:val="20"/>
               </w:rPr>
-              <w:t>0.48</w:t>
+              <w:t>0.45</w:t>
             </w:r>
           </w:p>
         </w:tc>
@@ -4288,7 +4288,7 @@
                 <w:i w:val="0"/>
                 <w:sz w:val="20"/>
               </w:rPr>
-              <w:t>0.54</w:t>
+              <w:t>0.58</w:t>
             </w:r>
           </w:p>
         </w:tc>
@@ -4344,7 +4344,7 @@
                 <w:i w:val="0"/>
                 <w:sz w:val="20"/>
               </w:rPr>
-              <w:t>Fusion (α=0.65)</w:t>
+              <w:t>Fusion (best α=0.45)</w:t>
             </w:r>
           </w:p>
         </w:tc>
@@ -4380,25 +4380,7 @@
                 <w:i w:val="0"/>
                 <w:sz w:val="20"/>
               </w:rPr>
-              <w:t>0.86</w:t>
-            </w:r>
-          </w:p>
-        </w:tc>
-        <w:tc>
-          <w:tcPr>
-            <w:tcW w:type="dxa" w:w="1560"/>
-          </w:tcPr>
-          <w:p>
-            <w:pPr>
-              <w:jc w:val="center"/>
-            </w:pPr>
-            <w:r>
-              <w:rPr>
-                <w:rFonts w:ascii="Times New Roman" w:hAnsi="Times New Roman"/>
-                <w:i w:val="0"/>
-                <w:sz w:val="20"/>
-              </w:rPr>
-              <w:t>0.77</w:t>
+              <w:t>0.84</w:t>
             </w:r>
           </w:p>
         </w:tc>
@@ -4417,6 +4399,24 @@
                 <w:sz w:val="20"/>
               </w:rPr>
               <w:t>0.81</w:t>
+            </w:r>
+          </w:p>
+        </w:tc>
+        <w:tc>
+          <w:tcPr>
+            <w:tcW w:type="dxa" w:w="1560"/>
+          </w:tcPr>
+          <w:p>
+            <w:pPr>
+              <w:jc w:val="center"/>
+            </w:pPr>
+            <w:r>
+              <w:rPr>
+                <w:rFonts w:ascii="Times New Roman" w:hAnsi="Times New Roman"/>
+                <w:i w:val="0"/>
+                <w:sz w:val="20"/>
+              </w:rPr>
+              <w:t>0.82</w:t>
             </w:r>
           </w:p>
         </w:tc>
@@ -4454,7 +4454,7 @@
                 <w:i w:val="0"/>
                 <w:sz w:val="20"/>
               </w:rPr>
-              <w:t>Fusion (α=0.65)</w:t>
+              <w:t>Fusion (best α=0.45)</w:t>
             </w:r>
           </w:p>
         </w:tc>
@@ -4490,7 +4490,7 @@
                 <w:i w:val="0"/>
                 <w:sz w:val="20"/>
               </w:rPr>
-              <w:t>0.77</w:t>
+              <w:t>0.78</w:t>
             </w:r>
           </w:p>
         </w:tc>
@@ -4508,7 +4508,7 @@
                 <w:i w:val="0"/>
                 <w:sz w:val="20"/>
               </w:rPr>
-              <w:t>0.73</w:t>
+              <w:t>0.74</w:t>
             </w:r>
           </w:p>
         </w:tc>
@@ -4526,7 +4526,7 @@
                 <w:i w:val="0"/>
                 <w:sz w:val="20"/>
               </w:rPr>
-              <w:t>0.75</w:t>
+              <w:t>0.76</w:t>
             </w:r>
           </w:p>
         </w:tc>
@@ -4564,7 +4564,7 @@
                 <w:i w:val="0"/>
                 <w:sz w:val="20"/>
               </w:rPr>
-              <w:t>Fusion (α=0.65)</w:t>
+              <w:t>Fusion (best α=0.45)</w:t>
             </w:r>
           </w:p>
         </w:tc>
@@ -4600,7 +4600,7 @@
                 <w:i w:val="0"/>
                 <w:sz w:val="20"/>
               </w:rPr>
-              <w:t>0.48</w:t>
+              <w:t>0.51</w:t>
             </w:r>
           </w:p>
         </w:tc>
@@ -4618,7 +4618,7 @@
                 <w:i w:val="0"/>
                 <w:sz w:val="20"/>
               </w:rPr>
-              <w:t>0.64</w:t>
+              <w:t>0.60</w:t>
             </w:r>
           </w:p>
         </w:tc>
@@ -4677,7 +4677,7 @@
           <w:i w:val="0"/>
           <w:sz w:val="22"/>
         </w:rPr>
-        <w:t>The per-class patterns reveal distinct strengths: the text model achieves strong Negative precision (0.86) — negative emotions involve specific vocabulary — but lower Negative recall (0.68), meaning 32% of truly negative utterances are missed. The audio model achieves higher Negative recall (0.80) — acoustic arousal cues are effective — but lower Positive recall (0.58 vs. 0.71 for text), as happy/excited speech is acoustically variable. Neutral has the lowest F1 across all models; fusion improves it most (+0.07).</w:t>
+        <w:t>The per-class patterns reveal distinct strengths: the text model achieves strong Negative precision (0.81) - negative emotions involve specific vocabulary - but lower Negative recall (0.72), meaning 28% of truly negative utterances are missed. The audio model achieves higher Negative recall (0.77) - acoustic arousal cues are effective - but lower Positive recall (0.59 vs. 0.70 for text), as happy/excited speech is acoustically variable. Neutral has the lowest F1 across all models; fusion improves it most (+0.09).</w:t>
       </w:r>
     </w:p>
     <w:p>
@@ -4703,7 +4703,7 @@
       <w:r>
         <w:drawing>
           <wp:inline xmlns:a="http://schemas.openxmlformats.org/drawingml/2006/main" xmlns:pic="http://schemas.openxmlformats.org/drawingml/2006/picture">
-            <wp:extent cx="5029200" cy="4765573"/>
+            <wp:extent cx="5029200" cy="5966012"/>
             <wp:docPr id="1" name="Picture 1"/>
             <wp:cNvGraphicFramePr>
               <a:graphicFrameLocks noChangeAspect="1"/>
@@ -4724,7 +4724,7 @@
                   <pic:spPr>
                     <a:xfrm>
                       <a:off x="0" y="0"/>
-                      <a:ext cx="5029200" cy="4765573"/>
+                      <a:ext cx="5029200" cy="5966012"/>
                     </a:xfrm>
                     <a:prstGeom prst="rect"/>
                   </pic:spPr>
@@ -4748,7 +4748,7 @@
           <w:color w:val="323232"/>
           <w:sz w:val="20"/>
         </w:rPr>
-        <w:t>Figure 1. Audio-only model (Wav2Vec2) results on Session 5: confusion matrices (raw counts and row-normalised) and per-class F1 bar chart. Macro F1 = 0.6403.</w:t>
+        <w:t>Figure 1. Audio-only model (Wav2Vec2) results on Session 5: confusion matrices (raw counts and row-normalised) and per-class F1 bar chart. Macro F1 = 0.6398.</w:t>
       </w:r>
     </w:p>
     <w:p>
@@ -4988,7 +4988,7 @@
                 <w:i w:val="0"/>
                 <w:sz w:val="20"/>
               </w:rPr>
-              <w:t>0.6403</w:t>
+              <w:t>0.6398</w:t>
             </w:r>
           </w:p>
         </w:tc>
@@ -5007,7 +5007,7 @@
                 <w:i w:val="0"/>
                 <w:sz w:val="20"/>
               </w:rPr>
-              <w:t>0.780</w:t>
+              <w:t>0.7825</w:t>
             </w:r>
           </w:p>
         </w:tc>
@@ -5026,7 +5026,7 @@
                 <w:i w:val="0"/>
                 <w:sz w:val="20"/>
               </w:rPr>
-              <w:t>0.633</w:t>
+              <w:t>0.6299</w:t>
             </w:r>
           </w:p>
         </w:tc>
@@ -5045,7 +5045,7 @@
                 <w:i w:val="0"/>
                 <w:sz w:val="20"/>
               </w:rPr>
-              <w:t>0.508</w:t>
+              <w:t>0.5070</w:t>
             </w:r>
           </w:p>
         </w:tc>
@@ -5104,7 +5104,7 @@
                 <w:i w:val="0"/>
                 <w:sz w:val="20"/>
               </w:rPr>
-              <w:t>0.6957</w:t>
+              <w:t>0.6874</w:t>
             </w:r>
           </w:p>
         </w:tc>
@@ -5123,7 +5123,7 @@
                 <w:i w:val="0"/>
                 <w:sz w:val="20"/>
               </w:rPr>
-              <w:t>0.825</w:t>
+              <w:t>0.8142</w:t>
             </w:r>
           </w:p>
         </w:tc>
@@ -5142,7 +5142,7 @@
                 <w:i w:val="0"/>
                 <w:sz w:val="20"/>
               </w:rPr>
-              <w:t>0.723</w:t>
+              <w:t>0.7151</w:t>
             </w:r>
           </w:p>
         </w:tc>
@@ -5161,7 +5161,239 @@
                 <w:i w:val="0"/>
                 <w:sz w:val="20"/>
               </w:rPr>
-              <w:t>0.540</w:t>
+              <w:t>0.5328</w:t>
+            </w:r>
+          </w:p>
+        </w:tc>
+      </w:tr>
+      <w:tr>
+        <w:tc>
+          <w:tcPr>
+            <w:tcW w:type="dxa" w:w="1560"/>
+          </w:tcPr>
+          <w:p>
+            <w:pPr>
+              <w:jc w:val="center"/>
+            </w:pPr>
+            <w:r>
+              <w:rPr>
+                <w:rFonts w:ascii="Times New Roman" w:hAnsi="Times New Roman"/>
+                <w:b w:val="0"/>
+                <w:i w:val="0"/>
+                <w:sz w:val="20"/>
+              </w:rPr>
+              <w:t>0.40</w:t>
+            </w:r>
+          </w:p>
+        </w:tc>
+        <w:tc>
+          <w:tcPr>
+            <w:tcW w:type="dxa" w:w="1560"/>
+          </w:tcPr>
+          <w:p>
+            <w:pPr>
+              <w:jc w:val="center"/>
+            </w:pPr>
+            <w:r>
+              <w:rPr>
+                <w:rFonts w:ascii="Times New Roman" w:hAnsi="Times New Roman"/>
+                <w:b w:val="0"/>
+                <w:i w:val="0"/>
+                <w:sz w:val="20"/>
+              </w:rPr>
+              <w:t>0.60</w:t>
+            </w:r>
+          </w:p>
+        </w:tc>
+        <w:tc>
+          <w:tcPr>
+            <w:tcW w:type="dxa" w:w="1560"/>
+          </w:tcPr>
+          <w:p>
+            <w:pPr>
+              <w:jc w:val="center"/>
+            </w:pPr>
+            <w:r>
+              <w:rPr>
+                <w:rFonts w:ascii="Times New Roman" w:hAnsi="Times New Roman"/>
+                <w:b w:val="0"/>
+                <w:i w:val="0"/>
+                <w:sz w:val="20"/>
+              </w:rPr>
+              <w:t>0.7038</w:t>
+            </w:r>
+          </w:p>
+        </w:tc>
+        <w:tc>
+          <w:tcPr>
+            <w:tcW w:type="dxa" w:w="1560"/>
+          </w:tcPr>
+          <w:p>
+            <w:pPr>
+              <w:jc w:val="center"/>
+            </w:pPr>
+            <w:r>
+              <w:rPr>
+                <w:rFonts w:ascii="Times New Roman" w:hAnsi="Times New Roman"/>
+                <w:b w:val="0"/>
+                <w:i w:val="0"/>
+                <w:sz w:val="20"/>
+              </w:rPr>
+              <w:t>0.8266</w:t>
+            </w:r>
+          </w:p>
+        </w:tc>
+        <w:tc>
+          <w:tcPr>
+            <w:tcW w:type="dxa" w:w="1560"/>
+          </w:tcPr>
+          <w:p>
+            <w:pPr>
+              <w:jc w:val="center"/>
+            </w:pPr>
+            <w:r>
+              <w:rPr>
+                <w:rFonts w:ascii="Times New Roman" w:hAnsi="Times New Roman"/>
+                <w:b w:val="0"/>
+                <w:i w:val="0"/>
+                <w:sz w:val="20"/>
+              </w:rPr>
+              <w:t>0.7430</w:t>
+            </w:r>
+          </w:p>
+        </w:tc>
+        <w:tc>
+          <w:tcPr>
+            <w:tcW w:type="dxa" w:w="1560"/>
+          </w:tcPr>
+          <w:p>
+            <w:pPr>
+              <w:jc w:val="center"/>
+            </w:pPr>
+            <w:r>
+              <w:rPr>
+                <w:rFonts w:ascii="Times New Roman" w:hAnsi="Times New Roman"/>
+                <w:b w:val="0"/>
+                <w:i w:val="0"/>
+                <w:sz w:val="20"/>
+              </w:rPr>
+              <w:t>0.5418</w:t>
+            </w:r>
+          </w:p>
+        </w:tc>
+      </w:tr>
+      <w:tr>
+        <w:tc>
+          <w:tcPr>
+            <w:tcW w:type="dxa" w:w="1560"/>
+          </w:tcPr>
+          <w:p>
+            <w:pPr>
+              <w:jc w:val="center"/>
+            </w:pPr>
+            <w:r>
+              <w:rPr>
+                <w:rFonts w:ascii="Times New Roman" w:hAnsi="Times New Roman"/>
+                <w:b/>
+                <w:i w:val="0"/>
+                <w:sz w:val="20"/>
+              </w:rPr>
+              <w:t>0.45 (best)</w:t>
+            </w:r>
+          </w:p>
+        </w:tc>
+        <w:tc>
+          <w:tcPr>
+            <w:tcW w:type="dxa" w:w="1560"/>
+          </w:tcPr>
+          <w:p>
+            <w:pPr>
+              <w:jc w:val="center"/>
+            </w:pPr>
+            <w:r>
+              <w:rPr>
+                <w:rFonts w:ascii="Times New Roman" w:hAnsi="Times New Roman"/>
+                <w:b/>
+                <w:i w:val="0"/>
+                <w:sz w:val="20"/>
+              </w:rPr>
+              <w:t>0.55</w:t>
+            </w:r>
+          </w:p>
+        </w:tc>
+        <w:tc>
+          <w:tcPr>
+            <w:tcW w:type="dxa" w:w="1560"/>
+          </w:tcPr>
+          <w:p>
+            <w:pPr>
+              <w:jc w:val="center"/>
+            </w:pPr>
+            <w:r>
+              <w:rPr>
+                <w:rFonts w:ascii="Times New Roman" w:hAnsi="Times New Roman"/>
+                <w:b/>
+                <w:i w:val="0"/>
+                <w:sz w:val="20"/>
+              </w:rPr>
+              <w:t>0.7108</w:t>
+            </w:r>
+          </w:p>
+        </w:tc>
+        <w:tc>
+          <w:tcPr>
+            <w:tcW w:type="dxa" w:w="1560"/>
+          </w:tcPr>
+          <w:p>
+            <w:pPr>
+              <w:jc w:val="center"/>
+            </w:pPr>
+            <w:r>
+              <w:rPr>
+                <w:rFonts w:ascii="Times New Roman" w:hAnsi="Times New Roman"/>
+                <w:b/>
+                <w:i w:val="0"/>
+                <w:sz w:val="20"/>
+              </w:rPr>
+              <w:t>0.8249</w:t>
+            </w:r>
+          </w:p>
+        </w:tc>
+        <w:tc>
+          <w:tcPr>
+            <w:tcW w:type="dxa" w:w="1560"/>
+          </w:tcPr>
+          <w:p>
+            <w:pPr>
+              <w:jc w:val="center"/>
+            </w:pPr>
+            <w:r>
+              <w:rPr>
+                <w:rFonts w:ascii="Times New Roman" w:hAnsi="Times New Roman"/>
+                <w:b/>
+                <w:i w:val="0"/>
+                <w:sz w:val="20"/>
+              </w:rPr>
+              <w:t>0.7561</w:t>
+            </w:r>
+          </w:p>
+        </w:tc>
+        <w:tc>
+          <w:tcPr>
+            <w:tcW w:type="dxa" w:w="1560"/>
+          </w:tcPr>
+          <w:p>
+            <w:pPr>
+              <w:jc w:val="center"/>
+            </w:pPr>
+            <w:r>
+              <w:rPr>
+                <w:rFonts w:ascii="Times New Roman" w:hAnsi="Times New Roman"/>
+                <w:b/>
+                <w:i w:val="0"/>
+                <w:sz w:val="20"/>
+              </w:rPr>
+              <w:t>0.5514</w:t>
             </w:r>
           </w:p>
         </w:tc>
@@ -5220,7 +5452,7 @@
                 <w:i w:val="0"/>
                 <w:sz w:val="20"/>
               </w:rPr>
-              <w:t>0.7058</w:t>
+              <w:t>0.7051</w:t>
             </w:r>
           </w:p>
         </w:tc>
@@ -5239,7 +5471,7 @@
                 <w:i w:val="0"/>
                 <w:sz w:val="20"/>
               </w:rPr>
-              <w:t>0.822</w:t>
+              <w:t>0.8183</w:t>
             </w:r>
           </w:p>
         </w:tc>
@@ -5258,7 +5490,7 @@
                 <w:i w:val="0"/>
                 <w:sz w:val="20"/>
               </w:rPr>
-              <w:t>0.749</w:t>
+              <w:t>0.7617</w:t>
             </w:r>
           </w:p>
         </w:tc>
@@ -5277,7 +5509,7 @@
                 <w:i w:val="0"/>
                 <w:sz w:val="20"/>
               </w:rPr>
-              <w:t>0.547</w:t>
+              <w:t>0.5354</w:t>
             </w:r>
           </w:p>
         </w:tc>
@@ -5336,7 +5568,7 @@
                 <w:i w:val="0"/>
                 <w:sz w:val="20"/>
               </w:rPr>
-              <w:t>0.7088</w:t>
+              <w:t>0.6964</w:t>
             </w:r>
           </w:p>
         </w:tc>
@@ -5355,7 +5587,7 @@
                 <w:i w:val="0"/>
                 <w:sz w:val="20"/>
               </w:rPr>
-              <w:t>0.822</w:t>
+              <w:t>0.8119</w:t>
             </w:r>
           </w:p>
         </w:tc>
@@ -5374,7 +5606,7 @@
                 <w:i w:val="0"/>
                 <w:sz w:val="20"/>
               </w:rPr>
-              <w:t>0.750</w:t>
+              <w:t>0.7614</w:t>
             </w:r>
           </w:p>
         </w:tc>
@@ -5393,123 +5625,7 @@
                 <w:i w:val="0"/>
                 <w:sz w:val="20"/>
               </w:rPr>
-              <w:t>0.555</w:t>
-            </w:r>
-          </w:p>
-        </w:tc>
-      </w:tr>
-      <w:tr>
-        <w:tc>
-          <w:tcPr>
-            <w:tcW w:type="dxa" w:w="1560"/>
-          </w:tcPr>
-          <w:p>
-            <w:pPr>
-              <w:jc w:val="center"/>
-            </w:pPr>
-            <w:r>
-              <w:rPr>
-                <w:rFonts w:ascii="Times New Roman" w:hAnsi="Times New Roman"/>
-                <w:b/>
-                <w:i w:val="0"/>
-                <w:sz w:val="20"/>
-              </w:rPr>
-              <w:t>0.60</w:t>
-            </w:r>
-          </w:p>
-        </w:tc>
-        <w:tc>
-          <w:tcPr>
-            <w:tcW w:type="dxa" w:w="1560"/>
-          </w:tcPr>
-          <w:p>
-            <w:pPr>
-              <w:jc w:val="center"/>
-            </w:pPr>
-            <w:r>
-              <w:rPr>
-                <w:rFonts w:ascii="Times New Roman" w:hAnsi="Times New Roman"/>
-                <w:b/>
-                <w:i w:val="0"/>
-                <w:sz w:val="20"/>
-              </w:rPr>
-              <w:t>0.40</w:t>
-            </w:r>
-          </w:p>
-        </w:tc>
-        <w:tc>
-          <w:tcPr>
-            <w:tcW w:type="dxa" w:w="1560"/>
-          </w:tcPr>
-          <w:p>
-            <w:pPr>
-              <w:jc w:val="center"/>
-            </w:pPr>
-            <w:r>
-              <w:rPr>
-                <w:rFonts w:ascii="Times New Roman" w:hAnsi="Times New Roman"/>
-                <w:b/>
-                <w:i w:val="0"/>
-                <w:sz w:val="20"/>
-              </w:rPr>
-              <w:t>0.7104</w:t>
-            </w:r>
-          </w:p>
-        </w:tc>
-        <w:tc>
-          <w:tcPr>
-            <w:tcW w:type="dxa" w:w="1560"/>
-          </w:tcPr>
-          <w:p>
-            <w:pPr>
-              <w:jc w:val="center"/>
-            </w:pPr>
-            <w:r>
-              <w:rPr>
-                <w:rFonts w:ascii="Times New Roman" w:hAnsi="Times New Roman"/>
-                <w:b/>
-                <w:i w:val="0"/>
-                <w:sz w:val="20"/>
-              </w:rPr>
-              <w:t>0.816</w:t>
-            </w:r>
-          </w:p>
-        </w:tc>
-        <w:tc>
-          <w:tcPr>
-            <w:tcW w:type="dxa" w:w="1560"/>
-          </w:tcPr>
-          <w:p>
-            <w:pPr>
-              <w:jc w:val="center"/>
-            </w:pPr>
-            <w:r>
-              <w:rPr>
-                <w:rFonts w:ascii="Times New Roman" w:hAnsi="Times New Roman"/>
-                <w:b/>
-                <w:i w:val="0"/>
-                <w:sz w:val="20"/>
-              </w:rPr>
-              <w:t>0.757</w:t>
-            </w:r>
-          </w:p>
-        </w:tc>
-        <w:tc>
-          <w:tcPr>
-            <w:tcW w:type="dxa" w:w="1560"/>
-          </w:tcPr>
-          <w:p>
-            <w:pPr>
-              <w:jc w:val="center"/>
-            </w:pPr>
-            <w:r>
-              <w:rPr>
-                <w:rFonts w:ascii="Times New Roman" w:hAnsi="Times New Roman"/>
-                <w:b/>
-                <w:i w:val="0"/>
-                <w:sz w:val="20"/>
-              </w:rPr>
-              <w:t>0.558</w:t>
+              <w:t>0.5159</w:t>
             </w:r>
           </w:p>
         </w:tc>
@@ -5568,7 +5684,7 @@
                 <w:i w:val="0"/>
                 <w:sz w:val="20"/>
               </w:rPr>
-              <w:t>0.7041</w:t>
+              <w:t>0.6943</w:t>
             </w:r>
           </w:p>
         </w:tc>
@@ -5587,7 +5703,7 @@
                 <w:i w:val="0"/>
                 <w:sz w:val="20"/>
               </w:rPr>
-              <w:t>0.813</w:t>
+              <w:t>0.8105</w:t>
             </w:r>
           </w:p>
         </w:tc>
@@ -5606,7 +5722,7 @@
                 <w:i w:val="0"/>
                 <w:sz w:val="20"/>
               </w:rPr>
-              <w:t>0.752</w:t>
+              <w:t>0.7539</w:t>
             </w:r>
           </w:p>
         </w:tc>
@@ -5625,123 +5741,7 @@
                 <w:i w:val="0"/>
                 <w:sz w:val="20"/>
               </w:rPr>
-              <w:t>0.547</w:t>
-            </w:r>
-          </w:p>
-        </w:tc>
-      </w:tr>
-      <w:tr>
-        <w:tc>
-          <w:tcPr>
-            <w:tcW w:type="dxa" w:w="1560"/>
-          </w:tcPr>
-          <w:p>
-            <w:pPr>
-              <w:jc w:val="center"/>
-            </w:pPr>
-            <w:r>
-              <w:rPr>
-                <w:rFonts w:ascii="Times New Roman" w:hAnsi="Times New Roman"/>
-                <w:b w:val="0"/>
-                <w:i w:val="0"/>
-                <w:sz w:val="20"/>
-              </w:rPr>
-              <w:t>0.70</w:t>
-            </w:r>
-          </w:p>
-        </w:tc>
-        <w:tc>
-          <w:tcPr>
-            <w:tcW w:type="dxa" w:w="1560"/>
-          </w:tcPr>
-          <w:p>
-            <w:pPr>
-              <w:jc w:val="center"/>
-            </w:pPr>
-            <w:r>
-              <w:rPr>
-                <w:rFonts w:ascii="Times New Roman" w:hAnsi="Times New Roman"/>
-                <w:b w:val="0"/>
-                <w:i w:val="0"/>
-                <w:sz w:val="20"/>
-              </w:rPr>
-              <w:t>0.30</w:t>
-            </w:r>
-          </w:p>
-        </w:tc>
-        <w:tc>
-          <w:tcPr>
-            <w:tcW w:type="dxa" w:w="1560"/>
-          </w:tcPr>
-          <w:p>
-            <w:pPr>
-              <w:jc w:val="center"/>
-            </w:pPr>
-            <w:r>
-              <w:rPr>
-                <w:rFonts w:ascii="Times New Roman" w:hAnsi="Times New Roman"/>
-                <w:b w:val="0"/>
-                <w:i w:val="0"/>
-                <w:sz w:val="20"/>
-              </w:rPr>
-              <w:t>0.6951</w:t>
-            </w:r>
-          </w:p>
-        </w:tc>
-        <w:tc>
-          <w:tcPr>
-            <w:tcW w:type="dxa" w:w="1560"/>
-          </w:tcPr>
-          <w:p>
-            <w:pPr>
-              <w:jc w:val="center"/>
-            </w:pPr>
-            <w:r>
-              <w:rPr>
-                <w:rFonts w:ascii="Times New Roman" w:hAnsi="Times New Roman"/>
-                <w:b w:val="0"/>
-                <w:i w:val="0"/>
-                <w:sz w:val="20"/>
-              </w:rPr>
-              <w:t>0.804</w:t>
-            </w:r>
-          </w:p>
-        </w:tc>
-        <w:tc>
-          <w:tcPr>
-            <w:tcW w:type="dxa" w:w="1560"/>
-          </w:tcPr>
-          <w:p>
-            <w:pPr>
-              <w:jc w:val="center"/>
-            </w:pPr>
-            <w:r>
-              <w:rPr>
-                <w:rFonts w:ascii="Times New Roman" w:hAnsi="Times New Roman"/>
-                <w:b w:val="0"/>
-                <w:i w:val="0"/>
-                <w:sz w:val="20"/>
-              </w:rPr>
-              <w:t>0.745</w:t>
-            </w:r>
-          </w:p>
-        </w:tc>
-        <w:tc>
-          <w:tcPr>
-            <w:tcW w:type="dxa" w:w="1560"/>
-          </w:tcPr>
-          <w:p>
-            <w:pPr>
-              <w:jc w:val="center"/>
-            </w:pPr>
-            <w:r>
-              <w:rPr>
-                <w:rFonts w:ascii="Times New Roman" w:hAnsi="Times New Roman"/>
-                <w:b w:val="0"/>
-                <w:i w:val="0"/>
-                <w:sz w:val="20"/>
-              </w:rPr>
-              <w:t>0.537</w:t>
+              <w:t>0.5184</w:t>
             </w:r>
           </w:p>
         </w:tc>
@@ -5800,7 +5800,7 @@
                 <w:i w:val="0"/>
                 <w:sz w:val="20"/>
               </w:rPr>
-              <w:t>0.6519</w:t>
+              <w:t>0.6475</w:t>
             </w:r>
           </w:p>
         </w:tc>
@@ -5819,7 +5819,7 @@
                 <w:i w:val="0"/>
                 <w:sz w:val="20"/>
               </w:rPr>
-              <w:t>0.760</w:t>
+              <w:t>0.7640</w:t>
             </w:r>
           </w:p>
         </w:tc>
@@ -5838,7 +5838,7 @@
                 <w:i w:val="0"/>
                 <w:sz w:val="20"/>
               </w:rPr>
-              <w:t>0.715</w:t>
+              <w:t>0.7152</w:t>
             </w:r>
           </w:p>
         </w:tc>
@@ -5857,7 +5857,7 @@
                 <w:i w:val="0"/>
                 <w:sz w:val="20"/>
               </w:rPr>
-              <w:t>0.481</w:t>
+              <w:t>0.4633</w:t>
             </w:r>
           </w:p>
         </w:tc>
@@ -5876,7 +5876,7 @@
       <w:r>
         <w:drawing>
           <wp:inline xmlns:a="http://schemas.openxmlformats.org/drawingml/2006/main" xmlns:pic="http://schemas.openxmlformats.org/drawingml/2006/picture">
-            <wp:extent cx="5303520" cy="3514649"/>
+            <wp:extent cx="5303520" cy="1887564"/>
             <wp:docPr id="2" name="Picture 2"/>
             <wp:cNvGraphicFramePr>
               <a:graphicFrameLocks noChangeAspect="1"/>
@@ -5897,7 +5897,7 @@
                   <pic:spPr>
                     <a:xfrm>
                       <a:off x="0" y="0"/>
-                      <a:ext cx="5303520" cy="3514649"/>
+                      <a:ext cx="5303520" cy="1887564"/>
                     </a:xfrm>
                     <a:prstGeom prst="rect"/>
                   </pic:spPr>
@@ -5921,7 +5921,7 @@
           <w:color w:val="323232"/>
           <w:sz w:val="20"/>
         </w:rPr>
-        <w:t>Figure 2. Fusion weight grid search on Session 5. Left: Macro F1 vs. α_text. Right: per-class F1 vs. α_text. Best α=0.60 marked with red dashed line; original α=0.65 marked with grey dotted line.</w:t>
+        <w:t>Figure 2. Fusion weight grid search on Session 5. Left: Macro F1 vs. α_text. Right: per-class F1 vs. α_text. Best α=0.45 marked with red dashed line; original α=0.65 marked with grey dotted line.</w:t>
       </w:r>
     </w:p>
     <w:p>
@@ -5936,7 +5936,7 @@
           <w:i w:val="0"/>
           <w:sz w:val="22"/>
         </w:rPr>
-        <w:t>The left panel shows a clear peak at α=0.60 (Macro F1=0.7104), with a relatively flat plateau in α ∈ [0.55, 0.70] — the model is not highly sensitive to the exact weight in this range. The right panel shows that the Neutral class benefits most from increasing text weight, while Negative F1 is the most stable across the full range. The endpoint values match the standalone model scores exactly (sanity check passes).</w:t>
+        <w:t>The left panel shows a clear peak at α=0.45 (Macro F1=0.7108), with a relatively flat plateau in α ∈ [0.35, 0.55] - the model is not highly sensitive to the exact weight in this range. The right panel shows that the Neutral class benefits most from increasing text weight, while Negative F1 is the most stable across the full range. The endpoint values match the standalone model scores exactly (sanity check passes).</w:t>
       </w:r>
     </w:p>
     <w:p>
@@ -6047,7 +6047,7 @@
           <w:i w:val="0"/>
           <w:sz w:val="22"/>
         </w:rPr>
-        <w:t xml:space="preserve"> No training cost — evaluation of 21 weight values takes seconds on CPU. Fully interpretable: each modality's contribution is directly visible through α. The +0.06 Macro F1 gain on 2,170 test utterances is practically meaningful, as it corresponds to approximately 130 additional utterances correctly classified.</w:t>
+        <w:t xml:space="preserve"> No training cost - evaluation of 21 weight values takes seconds on CPU. Fully interpretable: each modality's contribution is directly visible through α. The +0.06 Macro F1 gain on 2,170 test utterances is practically meaningful, with accuracy rising from 0.6843 to 0.7502 - approximately 143 additional utterances correctly classified.</w:t>
       </w:r>
     </w:p>
     <w:p>
@@ -6123,7 +6123,7 @@
           <w:i w:val="0"/>
           <w:sz w:val="22"/>
         </w:rPr>
-        <w:t>Neutral speech is defined negatively — it is neither clearly positive nor clearly negative. It therefore lacks distinctive vocabulary and distinctive prosodic patterns (no elevated pitch, no specific energy signature). Both unimodal models achieve their worst F1 on Neutral (0.48 for text, 0.51 for audio). The text model's Neutral precision of 0.39 is particularly notable: when it predicts 'Neutral', it is wrong more than 60% of the time, indicating over-prediction of this class.</w:t>
+        <w:t>Neutral speech is defined negatively - it is neither clearly positive nor clearly negative. It therefore lacks distinctive vocabulary and distinctive prosodic patterns (no elevated pitch, no specific energy signature). Both unimodal models achieve their worst F1 on Neutral (0.46 for text, 0.51 for audio). The text model's Neutral precision of 0.40 is particularly notable: when it predicts 'Neutral', it is wrong roughly 60% of the time, indicating over-prediction of this class.</w:t>
       </w:r>
     </w:p>
     <w:p>
@@ -6138,7 +6138,7 @@
           <w:i w:val="0"/>
           <w:sz w:val="22"/>
         </w:rPr>
-        <w:t xml:space="preserve">Fusion improves Neutral F1 to 0.55 (+0.07 over text-only). The key mechanism: the </w:t>
+        <w:t xml:space="preserve">Fusion improves Neutral F1 to 0.55 (+0.09 over text-only). The key mechanism: the </w:t>
       </w:r>
       <w:r>
         <w:rPr>
@@ -6219,7 +6219,7 @@
           <w:i w:val="0"/>
           <w:sz w:val="22"/>
         </w:rPr>
-        <w:t xml:space="preserve"> (Table 6): text achieves higher Negative precision (0.86 vs. 0.76) while audio achieves higher Negative recall (0.80 vs. 0.68). These are complementary strengths on the same class.</w:t>
+        <w:t xml:space="preserve"> (Table 6): text achieves higher Negative precision (0.81 vs. 0.80) while audio achieves higher Negative recall (0.77 vs. 0.72). These are complementary strengths on the same class.</w:t>
       </w:r>
     </w:p>
     <w:p>
@@ -6252,7 +6252,7 @@
           <w:i w:val="0"/>
           <w:sz w:val="22"/>
         </w:rPr>
-        <w:t xml:space="preserve"> text fails when emotional tone is present but wording is neutral (e.g., a mundane sentence said angrily — the acoustic signal is missed by a text model). Audio fails when emotional words are clear but vocal delivery is flat (e.g., formal speech, sarcasm — the semantic signal is missed by an audio model). These two error types are largely non-overlapping.</w:t>
+        <w:t xml:space="preserve"> text fails when emotional tone is present but wording is neutral (e.g., a mundane sentence said angrily - the acoustic signal is missed by a text model). Audio fails when emotional words are clear but vocal delivery is flat (e.g., formal speech, sarcasm - the semantic signal is missed by an audio model). These two error types are largely non-overlapping.</w:t>
       </w:r>
     </w:p>
     <w:p>
@@ -6350,7 +6350,7 @@
           <w:i w:val="0"/>
           <w:sz w:val="22"/>
         </w:rPr>
-        <w:t xml:space="preserve"> Ses05F_impro01_F001.wav — true label: Negative, text pred: Negative ✓, audio pred: Neutral ✗, fusion pred: Negative ✓. The transcript contains clearly negative phrasing that the text model identifies correctly; the audio model misses the emotional content, possibly due to a flat or restrained delivery.</w:t>
+        <w:t xml:space="preserve"> Ses05F_impro01_F001.wav - true label: Negative, text pred: Negative ✓, audio pred: Neutral ✗, fusion pred: Negative ✓. The transcript contains clearly negative phrasing that the text model identifies correctly; the audio model misses the emotional content, possibly due to a flat or restrained delivery.</w:t>
       </w:r>
     </w:p>
     <w:p>
@@ -6374,7 +6374,7 @@
           <w:i/>
           <w:sz w:val="22"/>
         </w:rPr>
-        <w:t>Audio correct / Text wrong:</w:t>
+        <w:t>Low-consensus failure case:</w:t>
       </w:r>
       <w:r>
         <w:rPr>
@@ -6383,7 +6383,7 @@
           <w:i w:val="0"/>
           <w:sz w:val="22"/>
         </w:rPr>
-        <w:t xml:space="preserve"> Ses05F_impro01_F000.wav — true label: Neutral, text pred: Positive ✗, audio pred: Negative ✗, fusion pred: Negative ✗. Both models struggle here — this is a Low-consensus utterance (annotators themselves disagreed on its label), illustrating why the hardest examples remain difficult even for fusion.</w:t>
+        <w:t xml:space="preserve"> Ses05F_impro01_F000.wav - true label: Neutral, text pred: Negative ✗, audio pred: Negative ✗, fusion pred: Negative ✗. Both models predict Negative here; this is a Low-consensus utterance (annotators themselves disagreed on its label), illustrating why the hardest examples remain difficult even for fusion.</w:t>
       </w:r>
     </w:p>
     <w:p>
@@ -6446,7 +6446,7 @@
           <w:i w:val="0"/>
           <w:sz w:val="22"/>
         </w:rPr>
-        <w:t>To verify that the headline results are not artifacts of the labeling procedure (§2.4), each model's predictions were re-scored against the Sum-then-Argmax ground truth. No retraining was performed — this is a purely evaluation-time analysis.</w:t>
+        <w:t>To verify that the headline results are not artifacts of the labeling procedure (§2.4), each model's predictions were re-scored against the Sum-then-Argmax ground truth. No retraining was performed - this is a purely evaluation-time analysis.</w:t>
       </w:r>
     </w:p>
     <w:p>
@@ -6593,7 +6593,7 @@
                 <w:i w:val="0"/>
                 <w:sz w:val="20"/>
               </w:rPr>
-              <w:t>0.6519</w:t>
+              <w:t>0.6475</w:t>
             </w:r>
           </w:p>
         </w:tc>
@@ -6611,7 +6611,81 @@
                 <w:i w:val="0"/>
                 <w:sz w:val="20"/>
               </w:rPr>
-              <w:t>0.6481</w:t>
+              <w:t>0.6506</w:t>
+            </w:r>
+          </w:p>
+        </w:tc>
+        <w:tc>
+          <w:tcPr>
+            <w:tcW w:type="dxa" w:w="2340"/>
+          </w:tcPr>
+          <w:p>
+            <w:pPr>
+              <w:jc w:val="center"/>
+            </w:pPr>
+            <w:r>
+              <w:rPr>
+                <w:rFonts w:ascii="Times New Roman" w:hAnsi="Times New Roman"/>
+                <w:i w:val="0"/>
+                <w:sz w:val="20"/>
+              </w:rPr>
+              <w:t>+0.003</w:t>
+            </w:r>
+          </w:p>
+        </w:tc>
+      </w:tr>
+      <w:tr>
+        <w:tc>
+          <w:tcPr>
+            <w:tcW w:type="dxa" w:w="2340"/>
+          </w:tcPr>
+          <w:p>
+            <w:pPr>
+              <w:jc w:val="center"/>
+            </w:pPr>
+            <w:r>
+              <w:rPr>
+                <w:rFonts w:ascii="Times New Roman" w:hAnsi="Times New Roman"/>
+                <w:i w:val="0"/>
+                <w:sz w:val="20"/>
+              </w:rPr>
+              <w:t>Audio-only</w:t>
+            </w:r>
+          </w:p>
+        </w:tc>
+        <w:tc>
+          <w:tcPr>
+            <w:tcW w:type="dxa" w:w="2340"/>
+          </w:tcPr>
+          <w:p>
+            <w:pPr>
+              <w:jc w:val="center"/>
+            </w:pPr>
+            <w:r>
+              <w:rPr>
+                <w:rFonts w:ascii="Times New Roman" w:hAnsi="Times New Roman"/>
+                <w:i w:val="0"/>
+                <w:sz w:val="20"/>
+              </w:rPr>
+              <w:t>0.6398</w:t>
+            </w:r>
+          </w:p>
+        </w:tc>
+        <w:tc>
+          <w:tcPr>
+            <w:tcW w:type="dxa" w:w="2340"/>
+          </w:tcPr>
+          <w:p>
+            <w:pPr>
+              <w:jc w:val="center"/>
+            </w:pPr>
+            <w:r>
+              <w:rPr>
+                <w:rFonts w:ascii="Times New Roman" w:hAnsi="Times New Roman"/>
+                <w:i w:val="0"/>
+                <w:sz w:val="20"/>
+              </w:rPr>
+              <w:t>0.6359</w:t>
             </w:r>
           </w:p>
         </w:tc>
@@ -6649,80 +6723,6 @@
                 <w:i w:val="0"/>
                 <w:sz w:val="20"/>
               </w:rPr>
-              <w:t>Audio-only</w:t>
-            </w:r>
-          </w:p>
-        </w:tc>
-        <w:tc>
-          <w:tcPr>
-            <w:tcW w:type="dxa" w:w="2340"/>
-          </w:tcPr>
-          <w:p>
-            <w:pPr>
-              <w:jc w:val="center"/>
-            </w:pPr>
-            <w:r>
-              <w:rPr>
-                <w:rFonts w:ascii="Times New Roman" w:hAnsi="Times New Roman"/>
-                <w:i w:val="0"/>
-                <w:sz w:val="20"/>
-              </w:rPr>
-              <w:t>0.6403</w:t>
-            </w:r>
-          </w:p>
-        </w:tc>
-        <w:tc>
-          <w:tcPr>
-            <w:tcW w:type="dxa" w:w="2340"/>
-          </w:tcPr>
-          <w:p>
-            <w:pPr>
-              <w:jc w:val="center"/>
-            </w:pPr>
-            <w:r>
-              <w:rPr>
-                <w:rFonts w:ascii="Times New Roman" w:hAnsi="Times New Roman"/>
-                <w:i w:val="0"/>
-                <w:sz w:val="20"/>
-              </w:rPr>
-              <w:t>0.6356</w:t>
-            </w:r>
-          </w:p>
-        </w:tc>
-        <w:tc>
-          <w:tcPr>
-            <w:tcW w:type="dxa" w:w="2340"/>
-          </w:tcPr>
-          <w:p>
-            <w:pPr>
-              <w:jc w:val="center"/>
-            </w:pPr>
-            <w:r>
-              <w:rPr>
-                <w:rFonts w:ascii="Times New Roman" w:hAnsi="Times New Roman"/>
-                <w:i w:val="0"/>
-                <w:sz w:val="20"/>
-              </w:rPr>
-              <w:t>−0.005</w:t>
-            </w:r>
-          </w:p>
-        </w:tc>
-      </w:tr>
-      <w:tr>
-        <w:tc>
-          <w:tcPr>
-            <w:tcW w:type="dxa" w:w="2340"/>
-          </w:tcPr>
-          <w:p>
-            <w:pPr>
-              <w:jc w:val="center"/>
-            </w:pPr>
-            <w:r>
-              <w:rPr>
-                <w:rFonts w:ascii="Times New Roman" w:hAnsi="Times New Roman"/>
-                <w:i w:val="0"/>
-                <w:sz w:val="20"/>
-              </w:rPr>
               <w:t>Late Fusion</w:t>
             </w:r>
           </w:p>
@@ -6741,7 +6741,7 @@
                 <w:i w:val="0"/>
                 <w:sz w:val="20"/>
               </w:rPr>
-              <w:t>0.7041</w:t>
+              <w:t>0.7108</w:t>
             </w:r>
           </w:p>
         </w:tc>
@@ -6759,7 +6759,7 @@
                 <w:i w:val="0"/>
                 <w:sz w:val="20"/>
               </w:rPr>
-              <w:t>0.6999</w:t>
+              <w:t>0.7081</w:t>
             </w:r>
           </w:p>
         </w:tc>
@@ -6777,7 +6777,7 @@
                 <w:i w:val="0"/>
                 <w:sz w:val="20"/>
               </w:rPr>
-              <w:t>−0.004</w:t>
+              <w:t>−0.003</w:t>
             </w:r>
           </w:p>
         </w:tc>
@@ -7034,7 +7034,7 @@
                 <w:i w:val="0"/>
                 <w:sz w:val="20"/>
               </w:rPr>
-              <w:t>0.262</w:t>
+              <w:t>0.308</w:t>
             </w:r>
           </w:p>
         </w:tc>
@@ -7052,7 +7052,7 @@
                 <w:i w:val="0"/>
                 <w:sz w:val="20"/>
               </w:rPr>
-              <w:t>0.233</w:t>
+              <w:t>0.285</w:t>
             </w:r>
           </w:p>
         </w:tc>
@@ -7126,7 +7126,7 @@
                 <w:i w:val="0"/>
                 <w:sz w:val="20"/>
               </w:rPr>
-              <w:t>0.578</w:t>
+              <w:t>0.585</w:t>
             </w:r>
           </w:p>
         </w:tc>
@@ -7144,7 +7144,7 @@
                 <w:i w:val="0"/>
                 <w:sz w:val="20"/>
               </w:rPr>
-              <w:t>0.581</w:t>
+              <w:t>0.588</w:t>
             </w:r>
           </w:p>
         </w:tc>
@@ -7218,7 +7218,7 @@
                 <w:i w:val="0"/>
                 <w:sz w:val="20"/>
               </w:rPr>
-              <w:t>0.779</w:t>
+              <w:t>0.792</w:t>
             </w:r>
           </w:p>
         </w:tc>
@@ -7236,7 +7236,7 @@
                 <w:i w:val="0"/>
                 <w:sz w:val="20"/>
               </w:rPr>
-              <w:t>0.694</w:t>
+              <w:t>0.695</w:t>
             </w:r>
           </w:p>
         </w:tc>
@@ -7310,7 +7310,7 @@
                 <w:i w:val="0"/>
                 <w:sz w:val="20"/>
               </w:rPr>
-              <w:t>0.477</w:t>
+              <w:t>0.369</w:t>
             </w:r>
           </w:p>
         </w:tc>
@@ -7328,7 +7328,7 @@
                 <w:i w:val="0"/>
                 <w:sz w:val="20"/>
               </w:rPr>
-              <w:t>0.363</w:t>
+              <w:t>0.308</w:t>
             </w:r>
           </w:p>
         </w:tc>
@@ -7420,7 +7420,7 @@
                 <w:i w:val="0"/>
                 <w:sz w:val="20"/>
               </w:rPr>
-              <w:t>0.574</w:t>
+              <w:t>0.580</w:t>
             </w:r>
           </w:p>
         </w:tc>
@@ -7494,7 +7494,7 @@
                 <w:i w:val="0"/>
                 <w:sz w:val="20"/>
               </w:rPr>
-              <w:t>0.773</w:t>
+              <w:t>0.768</w:t>
             </w:r>
           </w:p>
         </w:tc>
@@ -7512,7 +7512,7 @@
                 <w:i w:val="0"/>
                 <w:sz w:val="20"/>
               </w:rPr>
-              <w:t>0.674</w:t>
+              <w:t>0.666</w:t>
             </w:r>
           </w:p>
         </w:tc>
@@ -7586,7 +7586,7 @@
                 <w:i w:val="0"/>
                 <w:sz w:val="20"/>
               </w:rPr>
-              <w:t>0.369</w:t>
+              <w:t>0.385</w:t>
             </w:r>
           </w:p>
         </w:tc>
@@ -7604,7 +7604,7 @@
                 <w:i w:val="0"/>
                 <w:sz w:val="20"/>
               </w:rPr>
-              <w:t>0.318</w:t>
+              <w:t>0.344</w:t>
             </w:r>
           </w:p>
         </w:tc>
@@ -7678,7 +7678,7 @@
                 <w:i w:val="0"/>
                 <w:sz w:val="20"/>
               </w:rPr>
-              <w:t>0.632</w:t>
+              <w:t>0.648</w:t>
             </w:r>
           </w:p>
         </w:tc>
@@ -7696,7 +7696,7 @@
                 <w:i w:val="0"/>
                 <w:sz w:val="20"/>
               </w:rPr>
-              <w:t>0.631</w:t>
+              <w:t>0.645</w:t>
             </w:r>
           </w:p>
         </w:tc>
@@ -7770,7 +7770,7 @@
                 <w:i w:val="0"/>
                 <w:sz w:val="20"/>
               </w:rPr>
-              <w:t>0.839</w:t>
+              <w:t>0.851</w:t>
             </w:r>
           </w:p>
         </w:tc>
@@ -7788,7 +7788,7 @@
                 <w:i w:val="0"/>
                 <w:sz w:val="20"/>
               </w:rPr>
-              <w:t>0.754</w:t>
+              <w:t>0.766</w:t>
             </w:r>
           </w:p>
         </w:tc>
@@ -7811,7 +7811,7 @@
           <w:i w:val="0"/>
           <w:sz w:val="22"/>
         </w:rPr>
-        <w:t>All three models show strictly monotone improvement from Low to High consensus tier. This has two implications. First, model errors are not random — they concentrate precisely on the utterances that were intrinsically ambiguous to human annotators. Second, the High-tier Macro F1 (0.694, 0.674, 0.754 for text, audio, fusion) represents a meaningful performance ceiling: on utterances with near-unanimous human agreement, the models are substantially more reliable.</w:t>
+        <w:t>All three models show strictly monotone improvement from Low to High consensus tier. This has two implications. First, model errors are not random - they concentrate precisely on the utterances that were intrinsically ambiguous to human annotators. Second, the High-tier Macro F1 (0.695, 0.666, 0.766 for text, audio, fusion) represents a meaningful performance ceiling: on utterances with near-unanimous human agreement, the models are substantially more reliable.</w:t>
       </w:r>
     </w:p>
     <w:p>
@@ -7904,7 +7904,7 @@
           <w:i w:val="0"/>
           <w:sz w:val="22"/>
         </w:rPr>
-        <w:t xml:space="preserve"> Late fusion at optimal weight α=0.60 achieves Macro F1 of 0.7104, compared to 0.6519 for text-only and 0.6403 for audio-only — a gain of +0.06 requiring no additional training. The hypothesis is confirmed: the two modalities encode complementary emotional signals, and their combination is meaningfully more effective than either alone.</w:t>
+        <w:t xml:space="preserve"> Late fusion at optimal weight α=0.45 achieves Macro F1 of 0.7108, compared to 0.6475 for text-only and 0.6398 for audio-only - a gain of +0.06 requiring no additional training. The hypothesis is confirmed: the two modalities encode complementary emotional signals, and their combination is meaningfully more effective than either alone.</w:t>
       </w:r>
     </w:p>
     <w:p>
@@ -7966,7 +7966,7 @@
           <w:i w:val="0"/>
           <w:sz w:val="22"/>
         </w:rPr>
-        <w:t>Neutral is the hardest class across all models — it lacks distinctive words and prosody. Fusion helps it most (+0.07 F1 over text-only), because the joint absence of both signals is itself a cue for Neutral.</w:t>
+        <w:t>Neutral is the hardest class across all models - it lacks distinctive words and prosody. Fusion helps it most (+0.09 F1 over text-only), because the joint absence of both signals is itself a cue for Neutral.</w:t>
       </w:r>
     </w:p>
     <w:p>
@@ -7982,7 +7982,7 @@
           <w:i w:val="0"/>
           <w:sz w:val="22"/>
         </w:rPr>
-        <w:t>The optimal fusion weight α=0.60 reflects the text model's marginally higher unimodal performance. A plateau in α ∈ [0.55, 0.70] indicates robustness to the exact value.</w:t>
+        <w:t>The optimal fusion weight α_text=0.45 gives audio a slightly larger share despite text scoring marginally higher standalone (0.6475 vs. 0.6398), reflecting per-class complementarity rather than a simple ranking of the two unimodal scores. A plateau in α ∈ [0.35, 0.55] indicates robustness to the exact value.</w:t>
       </w:r>
     </w:p>
     <w:p>

</xml_diff>